<commit_message>
Resolve #27: Remove detalhes visuais dos casos de uso
</commit_message>
<xml_diff>
--- a/Requisitos/Documentos de Casos de Uso/CSU03-Entrar em contato com o proprietário.docx
+++ b/Requisitos/Documentos de Casos de Uso/CSU03-Entrar em contato com o proprietário.docx
@@ -129,10 +129,10 @@
           <w:tcPr>
             <w:tcW w:w="2905" w:type="dxa"/>
             <w:tcBorders>
-              <w:top w:val="single" w:color="000000" w:themeColor="accent6" w:sz="4"/>
-              <w:left w:val="single" w:color="000000" w:themeColor="accent6" w:sz="4"/>
-              <w:bottom w:val="single" w:color="000000" w:themeColor="accent6" w:sz="4"/>
-              <w:right w:val="single" w:color="000000" w:themeColor="accent6" w:sz="4"/>
+              <w:top w:val="single" w:color="" w:sz="4"/>
+              <w:left w:val="single" w:color="" w:sz="4"/>
+              <w:bottom w:val="single" w:color="" w:sz="4"/>
+              <w:right w:val="single" w:color="" w:sz="4"/>
             </w:tcBorders>
             <w:shd w:val="clear" w:color="auto" w:fill="FFFFFF"/>
             <w:tcMar>
@@ -176,10 +176,10 @@
           <w:tcPr>
             <w:tcW w:w="7425" w:type="dxa"/>
             <w:tcBorders>
-              <w:top w:val="single" w:color="000000" w:themeColor="accent6" w:sz="4"/>
-              <w:left w:val="single" w:color="000000" w:themeColor="accent6" w:sz="4"/>
-              <w:bottom w:val="single" w:color="000000" w:themeColor="accent6" w:sz="4"/>
-              <w:right w:val="single" w:color="000000" w:themeColor="accent6" w:sz="4"/>
+              <w:top w:val="single" w:color="" w:sz="4"/>
+              <w:left w:val="single" w:color="" w:sz="4"/>
+              <w:bottom w:val="single" w:color="" w:sz="4"/>
+              <w:right w:val="single" w:color="" w:sz="4"/>
             </w:tcBorders>
             <w:shd w:val="clear" w:color="auto" w:fill="FFFFFF"/>
             <w:tcMar>
@@ -243,10 +243,10 @@
           <w:tcPr>
             <w:tcW w:w="2905" w:type="dxa"/>
             <w:tcBorders>
-              <w:top w:val="single" w:color="000000" w:themeColor="accent6" w:sz="4"/>
-              <w:left w:val="single" w:color="000000" w:themeColor="accent6" w:sz="4"/>
-              <w:bottom w:val="single" w:color="000000" w:themeColor="accent6" w:sz="4"/>
-              <w:right w:val="single" w:color="000000" w:themeColor="accent6" w:sz="4"/>
+              <w:top w:val="single" w:color="" w:sz="4"/>
+              <w:left w:val="single" w:color="" w:sz="4"/>
+              <w:bottom w:val="single" w:color="" w:sz="4"/>
+              <w:right w:val="single" w:color="" w:sz="4"/>
             </w:tcBorders>
             <w:shd w:val="clear" w:color="auto" w:fill="FFFFFF"/>
             <w:tcMar>
@@ -290,10 +290,10 @@
           <w:tcPr>
             <w:tcW w:w="7425" w:type="dxa"/>
             <w:tcBorders>
-              <w:top w:val="single" w:color="000000" w:themeColor="accent6" w:sz="4"/>
-              <w:left w:val="single" w:color="000000" w:themeColor="accent6" w:sz="4"/>
-              <w:bottom w:val="single" w:color="000000" w:themeColor="accent6" w:sz="4"/>
-              <w:right w:val="single" w:color="000000" w:themeColor="accent6" w:sz="4"/>
+              <w:top w:val="single" w:color="" w:sz="4"/>
+              <w:left w:val="single" w:color="" w:sz="4"/>
+              <w:bottom w:val="single" w:color="" w:sz="4"/>
+              <w:right w:val="single" w:color="" w:sz="4"/>
             </w:tcBorders>
             <w:shd w:val="clear" w:color="auto" w:fill="FFFFFF"/>
             <w:tcMar>
@@ -341,10 +341,10 @@
           <w:tcPr>
             <w:tcW w:w="2905" w:type="dxa"/>
             <w:tcBorders>
-              <w:top w:val="single" w:color="000000" w:themeColor="accent6" w:sz="4"/>
-              <w:left w:val="single" w:color="000000" w:themeColor="accent6" w:sz="4"/>
-              <w:bottom w:val="single" w:color="000000" w:themeColor="accent6" w:sz="4"/>
-              <w:right w:val="single" w:color="000000" w:themeColor="accent6" w:sz="4"/>
+              <w:top w:val="single" w:color="" w:sz="4"/>
+              <w:left w:val="single" w:color="" w:sz="4"/>
+              <w:bottom w:val="single" w:color="" w:sz="4"/>
+              <w:right w:val="single" w:color="" w:sz="4"/>
             </w:tcBorders>
             <w:shd w:val="clear" w:color="auto" w:fill="FFFFFF"/>
             <w:tcMar>
@@ -388,10 +388,10 @@
           <w:tcPr>
             <w:tcW w:w="7425" w:type="dxa"/>
             <w:tcBorders>
-              <w:top w:val="single" w:color="000000" w:themeColor="accent6" w:sz="4"/>
-              <w:left w:val="single" w:color="000000" w:themeColor="accent6" w:sz="4"/>
-              <w:bottom w:val="single" w:color="000000" w:themeColor="accent6" w:sz="4"/>
-              <w:right w:val="single" w:color="000000" w:themeColor="accent6" w:sz="4"/>
+              <w:top w:val="single" w:color="" w:sz="4"/>
+              <w:left w:val="single" w:color="" w:sz="4"/>
+              <w:bottom w:val="single" w:color="" w:sz="4"/>
+              <w:right w:val="single" w:color="" w:sz="4"/>
             </w:tcBorders>
             <w:shd w:val="clear" w:color="auto" w:fill="FFFFFF"/>
             <w:tcMar>
@@ -439,10 +439,10 @@
           <w:tcPr>
             <w:tcW w:w="2905" w:type="dxa"/>
             <w:tcBorders>
-              <w:top w:val="single" w:color="000000" w:themeColor="accent6" w:sz="4"/>
-              <w:left w:val="single" w:color="000000" w:themeColor="accent6" w:sz="4"/>
-              <w:bottom w:val="single" w:color="000000" w:themeColor="accent6" w:sz="4"/>
-              <w:right w:val="single" w:color="000000" w:themeColor="accent6" w:sz="4"/>
+              <w:top w:val="single" w:color="" w:sz="4"/>
+              <w:left w:val="single" w:color="" w:sz="4"/>
+              <w:bottom w:val="single" w:color="" w:sz="4"/>
+              <w:right w:val="single" w:color="" w:sz="4"/>
             </w:tcBorders>
             <w:shd w:val="clear" w:color="auto" w:fill="FFFFFF"/>
             <w:tcMar>
@@ -486,10 +486,10 @@
           <w:tcPr>
             <w:tcW w:w="7425" w:type="dxa"/>
             <w:tcBorders>
-              <w:top w:val="single" w:color="000000" w:themeColor="accent6" w:sz="4"/>
-              <w:left w:val="single" w:color="000000" w:themeColor="accent6" w:sz="4"/>
-              <w:bottom w:val="single" w:color="000000" w:themeColor="accent6" w:sz="4"/>
-              <w:right w:val="single" w:color="000000" w:themeColor="accent6" w:sz="4"/>
+              <w:top w:val="single" w:color="" w:sz="4"/>
+              <w:left w:val="single" w:color="" w:sz="4"/>
+              <w:bottom w:val="single" w:color="" w:sz="4"/>
+              <w:right w:val="single" w:color="" w:sz="4"/>
             </w:tcBorders>
             <w:shd w:val="clear" w:color="auto" w:fill="FFFFFF"/>
             <w:tcMar>
@@ -537,10 +537,10 @@
           <w:tcPr>
             <w:tcW w:w="2905" w:type="dxa"/>
             <w:tcBorders>
-              <w:top w:val="single" w:color="000000" w:themeColor="accent6" w:sz="4"/>
-              <w:left w:val="single" w:color="000000" w:themeColor="accent6" w:sz="4"/>
-              <w:bottom w:val="single" w:color="000000" w:themeColor="accent6" w:sz="4"/>
-              <w:right w:val="single" w:color="000000" w:themeColor="accent6" w:sz="4"/>
+              <w:top w:val="single" w:color="" w:sz="4"/>
+              <w:left w:val="single" w:color="" w:sz="4"/>
+              <w:bottom w:val="single" w:color="" w:sz="4"/>
+              <w:right w:val="single" w:color="" w:sz="4"/>
             </w:tcBorders>
             <w:shd w:val="clear" w:color="auto" w:fill="FFFFFF"/>
             <w:tcMar>
@@ -584,10 +584,10 @@
           <w:tcPr>
             <w:tcW w:w="7425" w:type="dxa"/>
             <w:tcBorders>
-              <w:top w:val="single" w:color="000000" w:themeColor="accent6" w:sz="4"/>
-              <w:left w:val="single" w:color="000000" w:themeColor="accent6" w:sz="4"/>
-              <w:bottom w:val="single" w:color="000000" w:themeColor="accent6" w:sz="4"/>
-              <w:right w:val="single" w:color="000000" w:themeColor="accent6" w:sz="4"/>
+              <w:top w:val="single" w:color="" w:sz="4"/>
+              <w:left w:val="single" w:color="" w:sz="4"/>
+              <w:bottom w:val="single" w:color="" w:sz="4"/>
+              <w:right w:val="single" w:color="" w:sz="4"/>
             </w:tcBorders>
             <w:shd w:val="clear" w:color="auto" w:fill="FFFFFF"/>
             <w:tcMar>
@@ -660,10 +660,10 @@
           <w:tcPr>
             <w:tcW w:w="2905" w:type="dxa"/>
             <w:tcBorders>
-              <w:top w:val="single" w:color="000000" w:themeColor="accent6" w:sz="4"/>
-              <w:left w:val="single" w:color="000000" w:themeColor="accent6" w:sz="4"/>
-              <w:bottom w:val="single" w:color="000000" w:themeColor="accent6" w:sz="4"/>
-              <w:right w:val="single" w:color="000000" w:themeColor="accent6" w:sz="4"/>
+              <w:top w:val="single" w:color="" w:sz="4"/>
+              <w:left w:val="single" w:color="" w:sz="4"/>
+              <w:bottom w:val="single" w:color="" w:sz="4"/>
+              <w:right w:val="single" w:color="" w:sz="4"/>
             </w:tcBorders>
             <w:shd w:val="clear" w:color="auto" w:fill="FFFFFF"/>
             <w:tcMar>
@@ -707,10 +707,10 @@
           <w:tcPr>
             <w:tcW w:w="7425" w:type="dxa"/>
             <w:tcBorders>
-              <w:top w:val="single" w:color="000000" w:themeColor="accent6" w:sz="4"/>
-              <w:left w:val="single" w:color="000000" w:themeColor="accent6" w:sz="4"/>
-              <w:bottom w:val="single" w:color="000000" w:themeColor="accent6" w:sz="4"/>
-              <w:right w:val="single" w:color="000000" w:themeColor="accent6" w:sz="4"/>
+              <w:top w:val="single" w:color="" w:sz="4"/>
+              <w:left w:val="single" w:color="" w:sz="4"/>
+              <w:bottom w:val="single" w:color="" w:sz="4"/>
+              <w:right w:val="single" w:color="" w:sz="4"/>
             </w:tcBorders>
             <w:shd w:val="clear" w:color="auto" w:fill="FFFFFF"/>
             <w:tcMar>
@@ -759,10 +759,10 @@
             <w:tcW w:w="10330" w:type="dxa"/>
             <w:gridSpan w:val="2"/>
             <w:tcBorders>
-              <w:top w:val="single" w:color="000000" w:themeColor="accent6" w:sz="4"/>
-              <w:left w:val="single" w:color="000000" w:themeColor="accent6" w:sz="4"/>
-              <w:bottom w:val="single" w:color="000000" w:themeColor="accent6" w:sz="4"/>
-              <w:right w:val="single" w:color="000000" w:themeColor="accent6" w:sz="4"/>
+              <w:top w:val="single" w:color="" w:sz="4"/>
+              <w:left w:val="single" w:color="" w:sz="4"/>
+              <w:bottom w:val="single" w:color="" w:sz="4"/>
+              <w:right w:val="single" w:color="" w:sz="4"/>
             </w:tcBorders>
             <w:shd w:val="clear" w:color="auto" w:fill="FFFFFF"/>
             <w:tcMar>
@@ -814,10 +814,10 @@
             <w:tcW w:w="10330" w:type="dxa"/>
             <w:gridSpan w:val="2"/>
             <w:tcBorders>
-              <w:top w:val="single" w:color="000000" w:themeColor="accent6" w:sz="4"/>
-              <w:left w:val="single" w:color="000000" w:themeColor="accent6" w:sz="4"/>
-              <w:bottom w:val="single" w:color="000000" w:themeColor="accent6" w:sz="4"/>
-              <w:right w:val="single" w:color="000000" w:themeColor="accent6" w:sz="4"/>
+              <w:top w:val="single" w:color="" w:sz="4"/>
+              <w:left w:val="single" w:color="" w:sz="4"/>
+              <w:bottom w:val="single" w:color="" w:sz="4"/>
+              <w:right w:val="single" w:color="" w:sz="4"/>
             </w:tcBorders>
             <w:shd w:val="clear" w:color="auto" w:fill="FFFFFF"/>
             <w:tcMar>
@@ -828,12 +828,13 @@
           </w:tcPr>
           <w:p wp14:textId="4FEDCFF9">
             <w:pPr>
+              <w:pStyle w:val="ListParagraph"/>
               <w:numPr>
                 <w:ilvl w:val="0"/>
-                <w:numId w:val="23"/>
+                <w:numId w:val="30"/>
               </w:numPr>
               <w:spacing w:before="0" w:after="0" w:line="276" w:lineRule="auto"/>
-              <w:ind w:left="720" w:right="0" w:hanging="360"/>
+              <w:ind w:right="0"/>
               <w:jc w:val="left"/>
               <w:rPr>
                 <w:rFonts w:ascii="Calibri" w:hAnsi="Calibri" w:eastAsia="Calibri" w:cs="Calibri"/>
@@ -1003,12 +1004,13 @@
           </w:p>
           <w:p wp14:textId="77777777">
             <w:pPr>
+              <w:pStyle w:val="ListParagraph"/>
               <w:numPr>
                 <w:ilvl w:val="0"/>
-                <w:numId w:val="23"/>
+                <w:numId w:val="30"/>
               </w:numPr>
               <w:spacing w:before="0" w:after="0" w:line="276" w:lineRule="auto"/>
-              <w:ind w:left="720" w:right="0" w:hanging="360"/>
+              <w:ind w:right="0"/>
               <w:jc w:val="left"/>
               <w:rPr>
                 <w:rFonts w:ascii="Calibri" w:hAnsi="Calibri" w:eastAsia="Calibri" w:cs="Calibri"/>
@@ -1064,12 +1066,13 @@
           </w:p>
           <w:p wp14:textId="77777777">
             <w:pPr>
+              <w:pStyle w:val="ListParagraph"/>
               <w:numPr>
                 <w:ilvl w:val="0"/>
-                <w:numId w:val="23"/>
+                <w:numId w:val="30"/>
               </w:numPr>
               <w:spacing w:before="0" w:after="0" w:line="276" w:lineRule="auto"/>
-              <w:ind w:left="720" w:right="0" w:hanging="360"/>
+              <w:ind w:right="0"/>
               <w:jc w:val="left"/>
               <w:rPr>
                 <w:rFonts w:ascii="Calibri" w:hAnsi="Calibri" w:eastAsia="Calibri" w:cs="Calibri"/>
@@ -1099,12 +1102,13 @@
           </w:p>
           <w:p wp14:textId="77777777">
             <w:pPr>
+              <w:pStyle w:val="ListParagraph"/>
               <w:numPr>
                 <w:ilvl w:val="0"/>
-                <w:numId w:val="23"/>
+                <w:numId w:val="30"/>
               </w:numPr>
               <w:spacing w:before="0" w:after="0" w:line="276" w:lineRule="auto"/>
-              <w:ind w:left="720" w:right="0" w:hanging="360"/>
+              <w:ind w:right="0"/>
               <w:jc w:val="left"/>
               <w:rPr>
                 <w:rFonts w:ascii="Calibri" w:hAnsi="Calibri" w:eastAsia="Calibri" w:cs="Calibri"/>
@@ -1183,10 +1187,10 @@
             <w:tcW w:w="10330" w:type="dxa"/>
             <w:gridSpan w:val="2"/>
             <w:tcBorders>
-              <w:top w:val="single" w:color="000000" w:themeColor="accent6" w:sz="4"/>
-              <w:left w:val="single" w:color="000000" w:themeColor="accent6" w:sz="4"/>
-              <w:bottom w:val="single" w:color="000000" w:themeColor="accent6" w:sz="4"/>
-              <w:right w:val="single" w:color="000000" w:themeColor="accent6" w:sz="4"/>
+              <w:top w:val="single" w:color="" w:sz="4"/>
+              <w:left w:val="single" w:color="" w:sz="4"/>
+              <w:bottom w:val="single" w:color="" w:sz="4"/>
+              <w:right w:val="single" w:color="" w:sz="4"/>
             </w:tcBorders>
             <w:shd w:val="clear" w:color="auto" w:fill="FFFFFF"/>
             <w:tcMar>
@@ -1237,10 +1241,10 @@
             <w:tcW w:w="10330" w:type="dxa"/>
             <w:gridSpan w:val="2"/>
             <w:tcBorders>
-              <w:top w:val="single" w:color="000000" w:themeColor="accent6" w:sz="4"/>
-              <w:left w:val="single" w:color="000000" w:themeColor="accent6" w:sz="4"/>
-              <w:bottom w:val="single" w:color="000000" w:themeColor="accent6" w:sz="4"/>
-              <w:right w:val="single" w:color="000000" w:themeColor="accent6" w:sz="4"/>
+              <w:top w:val="single" w:color="" w:sz="4"/>
+              <w:left w:val="single" w:color="" w:sz="4"/>
+              <w:bottom w:val="single" w:color="" w:sz="4"/>
+              <w:right w:val="single" w:color="" w:sz="4"/>
             </w:tcBorders>
             <w:shd w:val="clear" w:color="auto" w:fill="FFFFFF"/>
             <w:tcMar>
@@ -2375,6 +2379,91 @@
 
 <file path=word/numbering.xml><?xml version="1.0" encoding="utf-8"?>
 <w:numbering xmlns:w="http://schemas.openxmlformats.org/wordprocessingml/2006/main">
+  <w:abstractNum xmlns:w="http://schemas.openxmlformats.org/wordprocessingml/2006/main" w:abstractNumId="7">
+    <w:nsid w:val="465bc069"/>
+    <w:multiLevelType xmlns:w="http://schemas.openxmlformats.org/wordprocessingml/2006/main" w:val="hybridMultilevel"/>
+    <w:lvl xmlns:w="http://schemas.openxmlformats.org/wordprocessingml/2006/main" w:ilvl="0">
+      <w:start w:val="1"/>
+      <w:numFmt w:val="decimal"/>
+      <w:lvlText w:val="%1."/>
+      <w:lvlJc w:val="left"/>
+      <w:pPr>
+        <w:ind w:left="720" w:hanging="360"/>
+      </w:pPr>
+    </w:lvl>
+    <w:lvl xmlns:w="http://schemas.openxmlformats.org/wordprocessingml/2006/main" w:ilvl="1">
+      <w:start w:val="1"/>
+      <w:numFmt w:val="lowerLetter"/>
+      <w:lvlText w:val="%2."/>
+      <w:lvlJc w:val="left"/>
+      <w:pPr>
+        <w:ind w:left="1440" w:hanging="360"/>
+      </w:pPr>
+    </w:lvl>
+    <w:lvl xmlns:w="http://schemas.openxmlformats.org/wordprocessingml/2006/main" w:ilvl="2">
+      <w:start w:val="1"/>
+      <w:numFmt w:val="lowerRoman"/>
+      <w:lvlText w:val="%3."/>
+      <w:lvlJc w:val="right"/>
+      <w:pPr>
+        <w:ind w:left="2160" w:hanging="180"/>
+      </w:pPr>
+    </w:lvl>
+    <w:lvl xmlns:w="http://schemas.openxmlformats.org/wordprocessingml/2006/main" w:ilvl="3">
+      <w:start w:val="1"/>
+      <w:numFmt w:val="decimal"/>
+      <w:lvlText w:val="%4."/>
+      <w:lvlJc w:val="left"/>
+      <w:pPr>
+        <w:ind w:left="2880" w:hanging="360"/>
+      </w:pPr>
+    </w:lvl>
+    <w:lvl xmlns:w="http://schemas.openxmlformats.org/wordprocessingml/2006/main" w:ilvl="4">
+      <w:start w:val="1"/>
+      <w:numFmt w:val="lowerLetter"/>
+      <w:lvlText w:val="%5."/>
+      <w:lvlJc w:val="left"/>
+      <w:pPr>
+        <w:ind w:left="3600" w:hanging="360"/>
+      </w:pPr>
+    </w:lvl>
+    <w:lvl xmlns:w="http://schemas.openxmlformats.org/wordprocessingml/2006/main" w:ilvl="5">
+      <w:start w:val="1"/>
+      <w:numFmt w:val="lowerRoman"/>
+      <w:lvlText w:val="%6."/>
+      <w:lvlJc w:val="right"/>
+      <w:pPr>
+        <w:ind w:left="4320" w:hanging="180"/>
+      </w:pPr>
+    </w:lvl>
+    <w:lvl xmlns:w="http://schemas.openxmlformats.org/wordprocessingml/2006/main" w:ilvl="6">
+      <w:start w:val="1"/>
+      <w:numFmt w:val="decimal"/>
+      <w:lvlText w:val="%7."/>
+      <w:lvlJc w:val="left"/>
+      <w:pPr>
+        <w:ind w:left="5040" w:hanging="360"/>
+      </w:pPr>
+    </w:lvl>
+    <w:lvl xmlns:w="http://schemas.openxmlformats.org/wordprocessingml/2006/main" w:ilvl="7">
+      <w:start w:val="1"/>
+      <w:numFmt w:val="lowerLetter"/>
+      <w:lvlText w:val="%8."/>
+      <w:lvlJc w:val="left"/>
+      <w:pPr>
+        <w:ind w:left="5760" w:hanging="360"/>
+      </w:pPr>
+    </w:lvl>
+    <w:lvl xmlns:w="http://schemas.openxmlformats.org/wordprocessingml/2006/main" w:ilvl="8">
+      <w:start w:val="1"/>
+      <w:numFmt w:val="lowerRoman"/>
+      <w:lvlText w:val="%9."/>
+      <w:lvlJc w:val="right"/>
+      <w:pPr>
+        <w:ind w:left="6480" w:hanging="180"/>
+      </w:pPr>
+    </w:lvl>
+  </w:abstractNum>
   <w:abstractNum w:abstractNumId="0">
     <w:lvl w:ilvl="0">
       <w:start w:val="1"/>
@@ -2391,6 +2480,9 @@
     </w:lvl>
     <w:nsid w:val="793431d6"/>
   </w:abstractNum>
+  <w:num w:numId="30">
+    <w:abstractNumId w:val="7"/>
+  </w:num>
   <w:num w:numId="23">
     <w:abstractNumId w:val="6"/>
   </w:num>
@@ -2449,5 +2541,17 @@
       </w:tblCellMar>
     </w:tblPr>
   </w:style>
+  <w:style w:type="paragraph" w:styleId="ListParagraph">
+    <w:uiPriority w:val="34"/>
+    <w:name w:val="List Paragraph"/>
+    <w:basedOn w:val="Normal"/>
+    <w:qFormat/>
+    <w:rsid w:val="36C73960"/>
+    <w:pPr>
+      <w:spacing/>
+      <w:ind w:left="720"/>
+      <w:contextualSpacing/>
+    </w:pPr>
+  </w:style>
 </w:styles>
 </file>
</xml_diff>